<commit_message>
Update Data Wrangling Challenge #1.docx
</commit_message>
<xml_diff>
--- a/2022_04_29 PWC Challenge 1 - Hotel Analytics/Data Wrangling Challenge #1.docx
+++ b/2022_04_29 PWC Challenge 1 - Hotel Analytics/Data Wrangling Challenge #1.docx
@@ -427,7 +427,10 @@
       <w:bookmarkStart w:id="4" w:name="_bjazdsvierim" w:colFirst="0" w:colLast="0"/>
       <w:bookmarkEnd w:id="4"/>
       <w:r>
-        <w:t>By May 13</w:t>
+        <w:t>May 1</w:t>
+      </w:r>
+      <w:r>
+        <w:t>8</w:t>
       </w:r>
     </w:p>
     <w:p/>
@@ -460,6 +463,48 @@
     </w:p>
     <w:p/>
     <w:p/>
+    <w:p/>
+    <w:p>
+      <w:r>
+        <w:t>Visualization options</w:t>
+      </w:r>
+    </w:p>
+    <w:p/>
+    <w:p>
+      <w:pPr>
+        <w:pStyle w:val="a5"/>
+        <w:numPr>
+          <w:ilvl w:val="0"/>
+          <w:numId w:val="1"/>
+        </w:numPr>
+      </w:pPr>
+      <w:r>
+        <w:t>Dynamic chart in Excel</w:t>
+      </w:r>
+    </w:p>
+    <w:p>
+      <w:pPr>
+        <w:pStyle w:val="a5"/>
+        <w:numPr>
+          <w:ilvl w:val="0"/>
+          <w:numId w:val="1"/>
+        </w:numPr>
+      </w:pPr>
+      <w:proofErr w:type="spellStart"/>
+      <w:r>
+        <w:t>R</w:t>
+      </w:r>
+      <w:proofErr w:type="spellEnd"/>
+      <w:r>
+        <w:t xml:space="preserve"> </w:t>
+      </w:r>
+      <w:r>
+        <w:sym w:font="Wingdings" w:char="F0E0"/>
+      </w:r>
+      <w:r>
+        <w:t xml:space="preserve"> D3.js and website</w:t>
+      </w:r>
+    </w:p>
     <w:p/>
     <w:p/>
     <w:p/>

</xml_diff>